<commit_message>
Update client checklist: email assistant section, plain section names
</commit_message>
<xml_diff>
--- a/docs/Smith-Bros-Client-Checklist.docx
+++ b/docs/Smith-Bros-Client-Checklist.docx
@@ -44,7 +44,7 @@
           <w:sz w:val="22"/>
           <w:szCs w:val="22"/>
         </w:rPr>
-        <w:t xml:space="preserve">Checklist for the Command Centre project: lead qualification, marketing emails, contracts and agreements, and the admin dashboard.</w:t>
+        <w:t xml:space="preserve">Checklist for the Command Centre project: website estimates and leads, the email assistant, marketing emails, contracts and agreements, and the admin dashboard.</w:t>
       </w:r>
     </w:p>
     <w:p>
@@ -1268,7 +1268,7 @@
           <w:sz w:val="30"/>
           <w:szCs w:val="30"/>
         </w:rPr>
-        <w:t xml:space="preserve">2. Estimates and lead qualification (System 1)</w:t>
+        <w:t xml:space="preserve">2. Website estimates and leads</w:t>
       </w:r>
     </w:p>
     <w:p>
@@ -3046,7 +3046,7 @@
           <w:sz w:val="30"/>
           <w:szCs w:val="30"/>
         </w:rPr>
-        <w:t xml:space="preserve">3. Contracts and agreements (System 3)</w:t>
+        <w:t xml:space="preserve">3. Contracts and agreements</w:t>
       </w:r>
     </w:p>
     <w:p>
@@ -4654,7 +4654,7 @@
           <w:sz w:val="30"/>
           <w:szCs w:val="30"/>
         </w:rPr>
-        <w:t xml:space="preserve">4. Marketing emails (System 2)</w:t>
+        <w:t xml:space="preserve">4. Marketing emails to customers</w:t>
       </w:r>
     </w:p>
     <w:p>
@@ -6087,7 +6087,1785 @@
           <w:sz w:val="30"/>
           <w:szCs w:val="30"/>
         </w:rPr>
-        <w:t xml:space="preserve">5. Accounts and access</w:t>
+        <w:t xml:space="preserve">5. Email assistant (reads, summarizes and drafts replies)</w:t>
+      </w:r>
+    </w:p>
+    <w:p>
+      <w:pPr>
+        <w:keepNext/>
+        <w:spacing w:after="120"/>
+      </w:pPr>
+      <w:r>
+        <w:rPr>
+          <w:rFonts w:ascii="Calibri" w:cs="Calibri" w:eastAsia="Calibri" w:hAnsi="Calibri"/>
+          <w:i/>
+          <w:iCs/>
+          <w:color w:val="5A4D42"/>
+          <w:sz w:val="20"/>
+          <w:szCs w:val="20"/>
+        </w:rPr>
+        <w:t xml:space="preserve">The assistant watches one business inbox, summarizes each email, links it to the customer, and drafts replies for the owner to approve. Nothing is ever sent without approval.</w:t>
+      </w:r>
+    </w:p>
+    <w:tbl>
+      <w:tblPr>
+        <w:tblW w:type="dxa" w:w="13800"/>
+        <w:tblBorders>
+          <w:top w:val="single" w:color="auto" w:sz="4"/>
+          <w:left w:val="single" w:color="auto" w:sz="4"/>
+          <w:bottom w:val="single" w:color="auto" w:sz="4"/>
+          <w:right w:val="single" w:color="auto" w:sz="4"/>
+          <w:insideH w:val="single" w:color="auto" w:sz="4"/>
+          <w:insideV w:val="single" w:color="auto" w:sz="4"/>
+        </w:tblBorders>
+      </w:tblPr>
+      <w:tblGrid>
+        <w:gridCol w:w="4800"/>
+        <w:gridCol w:w="3900"/>
+        <w:gridCol w:w="1900"/>
+        <w:gridCol w:w="1900"/>
+        <w:gridCol w:w="1300"/>
+      </w:tblGrid>
+      <w:tr>
+        <w:trPr>
+          <w:tblHeader/>
+        </w:trPr>
+        <w:tc>
+          <w:tcPr>
+            <w:tcW w:type="dxa" w:w="4800"/>
+            <w:tcBorders>
+              <w:top w:val="single" w:color="E2D9C9" w:sz="4"/>
+              <w:left w:val="single" w:color="E2D9C9" w:sz="4"/>
+              <w:bottom w:val="single" w:color="E2D9C9" w:sz="4"/>
+              <w:right w:val="single" w:color="E2D9C9" w:sz="4"/>
+            </w:tcBorders>
+            <w:shd w:fill="211A16" w:color="auto" w:val="clear"/>
+            <w:tcMar>
+              <w:top w:type="dxa" w:w="70"/>
+              <w:left w:type="dxa" w:w="100"/>
+              <w:bottom w:type="dxa" w:w="70"/>
+              <w:right w:type="dxa" w:w="100"/>
+            </w:tcMar>
+          </w:tcPr>
+          <w:p>
+            <w:pPr>
+              <w:jc w:val="left"/>
+            </w:pPr>
+            <w:r>
+              <w:rPr>
+                <w:rFonts w:ascii="Calibri" w:cs="Calibri" w:eastAsia="Calibri" w:hAnsi="Calibri"/>
+                <w:b/>
+                <w:bCs/>
+                <w:color w:val="FFFFFF"/>
+                <w:sz w:val="18"/>
+                <w:szCs w:val="18"/>
+              </w:rPr>
+              <w:t xml:space="preserve">What we need</w:t>
+            </w:r>
+          </w:p>
+        </w:tc>
+        <w:tc>
+          <w:tcPr>
+            <w:tcW w:type="dxa" w:w="3900"/>
+            <w:tcBorders>
+              <w:top w:val="single" w:color="E2D9C9" w:sz="4"/>
+              <w:left w:val="single" w:color="E2D9C9" w:sz="4"/>
+              <w:bottom w:val="single" w:color="E2D9C9" w:sz="4"/>
+              <w:right w:val="single" w:color="E2D9C9" w:sz="4"/>
+            </w:tcBorders>
+            <w:shd w:fill="211A16" w:color="auto" w:val="clear"/>
+            <w:tcMar>
+              <w:top w:type="dxa" w:w="70"/>
+              <w:left w:type="dxa" w:w="100"/>
+              <w:bottom w:type="dxa" w:w="70"/>
+              <w:right w:type="dxa" w:w="100"/>
+            </w:tcMar>
+          </w:tcPr>
+          <w:p>
+            <w:pPr>
+              <w:jc w:val="left"/>
+            </w:pPr>
+            <w:r>
+              <w:rPr>
+                <w:rFonts w:ascii="Calibri" w:cs="Calibri" w:eastAsia="Calibri" w:hAnsi="Calibri"/>
+                <w:b/>
+                <w:bCs/>
+                <w:color w:val="FFFFFF"/>
+                <w:sz w:val="18"/>
+                <w:szCs w:val="18"/>
+              </w:rPr>
+              <w:t xml:space="preserve">Why we need it</w:t>
+            </w:r>
+          </w:p>
+        </w:tc>
+        <w:tc>
+          <w:tcPr>
+            <w:tcW w:type="dxa" w:w="1900"/>
+            <w:tcBorders>
+              <w:top w:val="single" w:color="E2D9C9" w:sz="4"/>
+              <w:left w:val="single" w:color="E2D9C9" w:sz="4"/>
+              <w:bottom w:val="single" w:color="E2D9C9" w:sz="4"/>
+              <w:right w:val="single" w:color="E2D9C9" w:sz="4"/>
+            </w:tcBorders>
+            <w:shd w:fill="211A16" w:color="auto" w:val="clear"/>
+            <w:tcMar>
+              <w:top w:type="dxa" w:w="70"/>
+              <w:left w:type="dxa" w:w="100"/>
+              <w:bottom w:type="dxa" w:w="70"/>
+              <w:right w:type="dxa" w:w="100"/>
+            </w:tcMar>
+          </w:tcPr>
+          <w:p>
+            <w:pPr>
+              <w:jc w:val="left"/>
+            </w:pPr>
+            <w:r>
+              <w:rPr>
+                <w:rFonts w:ascii="Calibri" w:cs="Calibri" w:eastAsia="Calibri" w:hAnsi="Calibri"/>
+                <w:b/>
+                <w:bCs/>
+                <w:color w:val="FFFFFF"/>
+                <w:sz w:val="18"/>
+                <w:szCs w:val="18"/>
+              </w:rPr>
+              <w:t xml:space="preserve">From</w:t>
+            </w:r>
+          </w:p>
+        </w:tc>
+        <w:tc>
+          <w:tcPr>
+            <w:tcW w:type="dxa" w:w="1900"/>
+            <w:tcBorders>
+              <w:top w:val="single" w:color="E2D9C9" w:sz="4"/>
+              <w:left w:val="single" w:color="E2D9C9" w:sz="4"/>
+              <w:bottom w:val="single" w:color="E2D9C9" w:sz="4"/>
+              <w:right w:val="single" w:color="E2D9C9" w:sz="4"/>
+            </w:tcBorders>
+            <w:shd w:fill="211A16" w:color="auto" w:val="clear"/>
+            <w:tcMar>
+              <w:top w:type="dxa" w:w="70"/>
+              <w:left w:type="dxa" w:w="100"/>
+              <w:bottom w:type="dxa" w:w="70"/>
+              <w:right w:type="dxa" w:w="100"/>
+            </w:tcMar>
+          </w:tcPr>
+          <w:p>
+            <w:pPr>
+              <w:jc w:val="left"/>
+            </w:pPr>
+            <w:r>
+              <w:rPr>
+                <w:rFonts w:ascii="Calibri" w:cs="Calibri" w:eastAsia="Calibri" w:hAnsi="Calibri"/>
+                <w:b/>
+                <w:bCs/>
+                <w:color w:val="FFFFFF"/>
+                <w:sz w:val="18"/>
+                <w:szCs w:val="18"/>
+              </w:rPr>
+              <w:t xml:space="preserve">Needed for</w:t>
+            </w:r>
+          </w:p>
+        </w:tc>
+        <w:tc>
+          <w:tcPr>
+            <w:tcW w:type="dxa" w:w="1300"/>
+            <w:tcBorders>
+              <w:top w:val="single" w:color="E2D9C9" w:sz="4"/>
+              <w:left w:val="single" w:color="E2D9C9" w:sz="4"/>
+              <w:bottom w:val="single" w:color="E2D9C9" w:sz="4"/>
+              <w:right w:val="single" w:color="E2D9C9" w:sz="4"/>
+            </w:tcBorders>
+            <w:shd w:fill="211A16" w:color="auto" w:val="clear"/>
+            <w:tcMar>
+              <w:top w:type="dxa" w:w="70"/>
+              <w:left w:type="dxa" w:w="100"/>
+              <w:bottom w:type="dxa" w:w="70"/>
+              <w:right w:type="dxa" w:w="100"/>
+            </w:tcMar>
+          </w:tcPr>
+          <w:p>
+            <w:pPr>
+              <w:jc w:val="center"/>
+            </w:pPr>
+            <w:r>
+              <w:rPr>
+                <w:rFonts w:ascii="Calibri" w:cs="Calibri" w:eastAsia="Calibri" w:hAnsi="Calibri"/>
+                <w:b/>
+                <w:bCs/>
+                <w:color w:val="FFFFFF"/>
+                <w:sz w:val="18"/>
+                <w:szCs w:val="18"/>
+              </w:rPr>
+              <w:t xml:space="preserve">Done</w:t>
+            </w:r>
+          </w:p>
+        </w:tc>
+      </w:tr>
+      <w:tr>
+        <w:trPr>
+          <w:cantSplit/>
+        </w:trPr>
+        <w:tc>
+          <w:tcPr>
+            <w:tcW w:type="dxa" w:w="4800"/>
+            <w:tcBorders>
+              <w:top w:val="single" w:color="E2D9C9" w:sz="4"/>
+              <w:left w:val="single" w:color="E2D9C9" w:sz="4"/>
+              <w:bottom w:val="single" w:color="E2D9C9" w:sz="4"/>
+              <w:right w:val="single" w:color="E2D9C9" w:sz="4"/>
+            </w:tcBorders>
+            <w:tcMar>
+              <w:top w:type="dxa" w:w="70"/>
+              <w:left w:type="dxa" w:w="100"/>
+              <w:bottom w:type="dxa" w:w="70"/>
+              <w:right w:type="dxa" w:w="100"/>
+            </w:tcMar>
+          </w:tcPr>
+          <w:p>
+            <w:pPr>
+              <w:jc w:val="left"/>
+            </w:pPr>
+            <w:r>
+              <w:rPr>
+                <w:rFonts w:ascii="Calibri" w:cs="Calibri" w:eastAsia="Calibri" w:hAnsi="Calibri"/>
+                <w:b w:val="false"/>
+                <w:bCs w:val="false"/>
+                <w:color w:val="211A16"/>
+                <w:sz w:val="19"/>
+                <w:szCs w:val="19"/>
+              </w:rPr>
+              <w:t xml:space="preserve">Which Gmail or Google Workspace address the assistant should watch (a dedicated business inbox such as info@ or sales@, not a personal mailbox)</w:t>
+            </w:r>
+          </w:p>
+        </w:tc>
+        <w:tc>
+          <w:tcPr>
+            <w:tcW w:type="dxa" w:w="3900"/>
+            <w:tcBorders>
+              <w:top w:val="single" w:color="E2D9C9" w:sz="4"/>
+              <w:left w:val="single" w:color="E2D9C9" w:sz="4"/>
+              <w:bottom w:val="single" w:color="E2D9C9" w:sz="4"/>
+              <w:right w:val="single" w:color="E2D9C9" w:sz="4"/>
+            </w:tcBorders>
+            <w:tcMar>
+              <w:top w:type="dxa" w:w="70"/>
+              <w:left w:type="dxa" w:w="100"/>
+              <w:bottom w:type="dxa" w:w="70"/>
+              <w:right w:type="dxa" w:w="100"/>
+            </w:tcMar>
+          </w:tcPr>
+          <w:p>
+            <w:pPr>
+              <w:jc w:val="left"/>
+            </w:pPr>
+            <w:r>
+              <w:rPr>
+                <w:rFonts w:ascii="Calibri" w:cs="Calibri" w:eastAsia="Calibri" w:hAnsi="Calibri"/>
+                <w:b w:val="false"/>
+                <w:bCs w:val="false"/>
+                <w:color w:val="5A4D42"/>
+                <w:sz w:val="19"/>
+                <w:szCs w:val="19"/>
+              </w:rPr>
+              <w:t xml:space="preserve">It only ever sees this inbox</w:t>
+            </w:r>
+          </w:p>
+        </w:tc>
+        <w:tc>
+          <w:tcPr>
+            <w:tcW w:type="dxa" w:w="1900"/>
+            <w:tcBorders>
+              <w:top w:val="single" w:color="E2D9C9" w:sz="4"/>
+              <w:left w:val="single" w:color="E2D9C9" w:sz="4"/>
+              <w:bottom w:val="single" w:color="E2D9C9" w:sz="4"/>
+              <w:right w:val="single" w:color="E2D9C9" w:sz="4"/>
+            </w:tcBorders>
+            <w:tcMar>
+              <w:top w:type="dxa" w:w="70"/>
+              <w:left w:type="dxa" w:w="100"/>
+              <w:bottom w:type="dxa" w:w="70"/>
+              <w:right w:type="dxa" w:w="100"/>
+            </w:tcMar>
+          </w:tcPr>
+          <w:p>
+            <w:pPr>
+              <w:jc w:val="left"/>
+            </w:pPr>
+            <w:r>
+              <w:rPr>
+                <w:rFonts w:ascii="Calibri" w:cs="Calibri" w:eastAsia="Calibri" w:hAnsi="Calibri"/>
+                <w:b w:val="false"/>
+                <w:bCs w:val="false"/>
+                <w:color w:val="211A16"/>
+                <w:sz w:val="19"/>
+                <w:szCs w:val="19"/>
+              </w:rPr>
+              <w:t xml:space="preserve">Paul / Madison</w:t>
+            </w:r>
+          </w:p>
+        </w:tc>
+        <w:tc>
+          <w:tcPr>
+            <w:tcW w:type="dxa" w:w="1900"/>
+            <w:tcBorders>
+              <w:top w:val="single" w:color="E2D9C9" w:sz="4"/>
+              <w:left w:val="single" w:color="E2D9C9" w:sz="4"/>
+              <w:bottom w:val="single" w:color="E2D9C9" w:sz="4"/>
+              <w:right w:val="single" w:color="E2D9C9" w:sz="4"/>
+            </w:tcBorders>
+            <w:tcMar>
+              <w:top w:type="dxa" w:w="70"/>
+              <w:left w:type="dxa" w:w="100"/>
+              <w:bottom w:type="dxa" w:w="70"/>
+              <w:right w:type="dxa" w:w="100"/>
+            </w:tcMar>
+          </w:tcPr>
+          <w:p>
+            <w:pPr>
+              <w:jc w:val="left"/>
+            </w:pPr>
+            <w:r>
+              <w:rPr>
+                <w:rFonts w:ascii="Calibri" w:cs="Calibri" w:eastAsia="Calibri" w:hAnsi="Calibri"/>
+                <w:b w:val="false"/>
+                <w:bCs w:val="false"/>
+                <w:color w:val="211A16"/>
+                <w:sz w:val="19"/>
+                <w:szCs w:val="19"/>
+              </w:rPr>
+              <w:t xml:space="preserve">Build</w:t>
+            </w:r>
+          </w:p>
+        </w:tc>
+        <w:tc>
+          <w:tcPr>
+            <w:tcW w:type="dxa" w:w="1300"/>
+            <w:tcBorders>
+              <w:top w:val="single" w:color="E2D9C9" w:sz="4"/>
+              <w:left w:val="single" w:color="E2D9C9" w:sz="4"/>
+              <w:bottom w:val="single" w:color="E2D9C9" w:sz="4"/>
+              <w:right w:val="single" w:color="E2D9C9" w:sz="4"/>
+            </w:tcBorders>
+            <w:tcMar>
+              <w:top w:type="dxa" w:w="70"/>
+              <w:left w:type="dxa" w:w="100"/>
+              <w:bottom w:type="dxa" w:w="70"/>
+              <w:right w:type="dxa" w:w="100"/>
+            </w:tcMar>
+          </w:tcPr>
+          <w:p>
+            <w:pPr>
+              <w:jc w:val="center"/>
+            </w:pPr>
+            <w:r>
+              <w:rPr>
+                <w:rFonts w:ascii="Calibri" w:cs="Calibri" w:eastAsia="Calibri" w:hAnsi="Calibri"/>
+                <w:b w:val="false"/>
+                <w:bCs w:val="false"/>
+                <w:color w:val="211A16"/>
+                <w:sz w:val="26"/>
+                <w:szCs w:val="26"/>
+              </w:rPr>
+              <w:t xml:space="preserve">☐</w:t>
+            </w:r>
+          </w:p>
+        </w:tc>
+      </w:tr>
+      <w:tr>
+        <w:trPr>
+          <w:cantSplit/>
+        </w:trPr>
+        <w:tc>
+          <w:tcPr>
+            <w:tcW w:type="dxa" w:w="4800"/>
+            <w:tcBorders>
+              <w:top w:val="single" w:color="E2D9C9" w:sz="4"/>
+              <w:left w:val="single" w:color="E2D9C9" w:sz="4"/>
+              <w:bottom w:val="single" w:color="E2D9C9" w:sz="4"/>
+              <w:right w:val="single" w:color="E2D9C9" w:sz="4"/>
+            </w:tcBorders>
+            <w:shd w:fill="FBF8F2" w:color="auto" w:val="clear"/>
+            <w:tcMar>
+              <w:top w:type="dxa" w:w="70"/>
+              <w:left w:type="dxa" w:w="100"/>
+              <w:bottom w:type="dxa" w:w="70"/>
+              <w:right w:type="dxa" w:w="100"/>
+            </w:tcMar>
+          </w:tcPr>
+          <w:p>
+            <w:pPr>
+              <w:jc w:val="left"/>
+            </w:pPr>
+            <w:r>
+              <w:rPr>
+                <w:rFonts w:ascii="Calibri" w:cs="Calibri" w:eastAsia="Calibri" w:hAnsi="Calibri"/>
+                <w:b w:val="false"/>
+                <w:bCs w:val="false"/>
+                <w:color w:val="211A16"/>
+                <w:sz w:val="19"/>
+                <w:szCs w:val="19"/>
+              </w:rPr>
+              <w:t xml:space="preserve">Someone who can sign in to that Google account and approve the connection (a Google Workspace admin may need to allow it)</w:t>
+            </w:r>
+          </w:p>
+        </w:tc>
+        <w:tc>
+          <w:tcPr>
+            <w:tcW w:type="dxa" w:w="3900"/>
+            <w:tcBorders>
+              <w:top w:val="single" w:color="E2D9C9" w:sz="4"/>
+              <w:left w:val="single" w:color="E2D9C9" w:sz="4"/>
+              <w:bottom w:val="single" w:color="E2D9C9" w:sz="4"/>
+              <w:right w:val="single" w:color="E2D9C9" w:sz="4"/>
+            </w:tcBorders>
+            <w:shd w:fill="FBF8F2" w:color="auto" w:val="clear"/>
+            <w:tcMar>
+              <w:top w:type="dxa" w:w="70"/>
+              <w:left w:type="dxa" w:w="100"/>
+              <w:bottom w:type="dxa" w:w="70"/>
+              <w:right w:type="dxa" w:w="100"/>
+            </w:tcMar>
+          </w:tcPr>
+          <w:p>
+            <w:pPr>
+              <w:jc w:val="left"/>
+            </w:pPr>
+            <w:r>
+              <w:rPr>
+                <w:rFonts w:ascii="Calibri" w:cs="Calibri" w:eastAsia="Calibri" w:hAnsi="Calibri"/>
+                <w:b w:val="false"/>
+                <w:bCs w:val="false"/>
+                <w:color w:val="5A4D42"/>
+                <w:sz w:val="19"/>
+                <w:szCs w:val="19"/>
+              </w:rPr>
+              <w:t xml:space="preserve">Connects the inbox securely. We cannot do this step for you</w:t>
+            </w:r>
+          </w:p>
+        </w:tc>
+        <w:tc>
+          <w:tcPr>
+            <w:tcW w:type="dxa" w:w="1900"/>
+            <w:tcBorders>
+              <w:top w:val="single" w:color="E2D9C9" w:sz="4"/>
+              <w:left w:val="single" w:color="E2D9C9" w:sz="4"/>
+              <w:bottom w:val="single" w:color="E2D9C9" w:sz="4"/>
+              <w:right w:val="single" w:color="E2D9C9" w:sz="4"/>
+            </w:tcBorders>
+            <w:shd w:fill="FBF8F2" w:color="auto" w:val="clear"/>
+            <w:tcMar>
+              <w:top w:type="dxa" w:w="70"/>
+              <w:left w:type="dxa" w:w="100"/>
+              <w:bottom w:type="dxa" w:w="70"/>
+              <w:right w:type="dxa" w:w="100"/>
+            </w:tcMar>
+          </w:tcPr>
+          <w:p>
+            <w:pPr>
+              <w:jc w:val="left"/>
+            </w:pPr>
+            <w:r>
+              <w:rPr>
+                <w:rFonts w:ascii="Calibri" w:cs="Calibri" w:eastAsia="Calibri" w:hAnsi="Calibri"/>
+                <w:b w:val="false"/>
+                <w:bCs w:val="false"/>
+                <w:color w:val="211A16"/>
+                <w:sz w:val="19"/>
+                <w:szCs w:val="19"/>
+              </w:rPr>
+              <w:t xml:space="preserve">Paul / Madison / IT</w:t>
+            </w:r>
+          </w:p>
+        </w:tc>
+        <w:tc>
+          <w:tcPr>
+            <w:tcW w:type="dxa" w:w="1900"/>
+            <w:tcBorders>
+              <w:top w:val="single" w:color="E2D9C9" w:sz="4"/>
+              <w:left w:val="single" w:color="E2D9C9" w:sz="4"/>
+              <w:bottom w:val="single" w:color="E2D9C9" w:sz="4"/>
+              <w:right w:val="single" w:color="E2D9C9" w:sz="4"/>
+            </w:tcBorders>
+            <w:shd w:fill="FBF8F2" w:color="auto" w:val="clear"/>
+            <w:tcMar>
+              <w:top w:type="dxa" w:w="70"/>
+              <w:left w:type="dxa" w:w="100"/>
+              <w:bottom w:type="dxa" w:w="70"/>
+              <w:right w:type="dxa" w:w="100"/>
+            </w:tcMar>
+          </w:tcPr>
+          <w:p>
+            <w:pPr>
+              <w:jc w:val="left"/>
+            </w:pPr>
+            <w:r>
+              <w:rPr>
+                <w:rFonts w:ascii="Calibri" w:cs="Calibri" w:eastAsia="Calibri" w:hAnsi="Calibri"/>
+                <w:b w:val="false"/>
+                <w:bCs w:val="false"/>
+                <w:color w:val="211A16"/>
+                <w:sz w:val="19"/>
+                <w:szCs w:val="19"/>
+              </w:rPr>
+              <w:t xml:space="preserve">Build</w:t>
+            </w:r>
+          </w:p>
+        </w:tc>
+        <w:tc>
+          <w:tcPr>
+            <w:tcW w:type="dxa" w:w="1300"/>
+            <w:tcBorders>
+              <w:top w:val="single" w:color="E2D9C9" w:sz="4"/>
+              <w:left w:val="single" w:color="E2D9C9" w:sz="4"/>
+              <w:bottom w:val="single" w:color="E2D9C9" w:sz="4"/>
+              <w:right w:val="single" w:color="E2D9C9" w:sz="4"/>
+            </w:tcBorders>
+            <w:shd w:fill="FBF8F2" w:color="auto" w:val="clear"/>
+            <w:tcMar>
+              <w:top w:type="dxa" w:w="70"/>
+              <w:left w:type="dxa" w:w="100"/>
+              <w:bottom w:type="dxa" w:w="70"/>
+              <w:right w:type="dxa" w:w="100"/>
+            </w:tcMar>
+          </w:tcPr>
+          <w:p>
+            <w:pPr>
+              <w:jc w:val="center"/>
+            </w:pPr>
+            <w:r>
+              <w:rPr>
+                <w:rFonts w:ascii="Calibri" w:cs="Calibri" w:eastAsia="Calibri" w:hAnsi="Calibri"/>
+                <w:b w:val="false"/>
+                <w:bCs w:val="false"/>
+                <w:color w:val="211A16"/>
+                <w:sz w:val="26"/>
+                <w:szCs w:val="26"/>
+              </w:rPr>
+              <w:t xml:space="preserve">☐</w:t>
+            </w:r>
+          </w:p>
+        </w:tc>
+      </w:tr>
+      <w:tr>
+        <w:trPr>
+          <w:cantSplit/>
+        </w:trPr>
+        <w:tc>
+          <w:tcPr>
+            <w:tcW w:type="dxa" w:w="4800"/>
+            <w:tcBorders>
+              <w:top w:val="single" w:color="E2D9C9" w:sz="4"/>
+              <w:left w:val="single" w:color="E2D9C9" w:sz="4"/>
+              <w:bottom w:val="single" w:color="E2D9C9" w:sz="4"/>
+              <w:right w:val="single" w:color="E2D9C9" w:sz="4"/>
+            </w:tcBorders>
+            <w:tcMar>
+              <w:top w:type="dxa" w:w="70"/>
+              <w:left w:type="dxa" w:w="100"/>
+              <w:bottom w:type="dxa" w:w="70"/>
+              <w:right w:type="dxa" w:w="100"/>
+            </w:tcMar>
+          </w:tcPr>
+          <w:p>
+            <w:pPr>
+              <w:jc w:val="left"/>
+            </w:pPr>
+            <w:r>
+              <w:rPr>
+                <w:rFonts w:ascii="Calibri" w:cs="Calibri" w:eastAsia="Calibri" w:hAnsi="Calibri"/>
+                <w:b w:val="false"/>
+                <w:bCs w:val="false"/>
+                <w:color w:val="211A16"/>
+                <w:sz w:val="19"/>
+                <w:szCs w:val="19"/>
+              </w:rPr>
+              <w:t xml:space="preserve">10 to 20 examples of real replies the owner has sent to customers (names can be removed)</w:t>
+            </w:r>
+          </w:p>
+        </w:tc>
+        <w:tc>
+          <w:tcPr>
+            <w:tcW w:type="dxa" w:w="3900"/>
+            <w:tcBorders>
+              <w:top w:val="single" w:color="E2D9C9" w:sz="4"/>
+              <w:left w:val="single" w:color="E2D9C9" w:sz="4"/>
+              <w:bottom w:val="single" w:color="E2D9C9" w:sz="4"/>
+              <w:right w:val="single" w:color="E2D9C9" w:sz="4"/>
+            </w:tcBorders>
+            <w:tcMar>
+              <w:top w:type="dxa" w:w="70"/>
+              <w:left w:type="dxa" w:w="100"/>
+              <w:bottom w:type="dxa" w:w="70"/>
+              <w:right w:type="dxa" w:w="100"/>
+            </w:tcMar>
+          </w:tcPr>
+          <w:p>
+            <w:pPr>
+              <w:jc w:val="left"/>
+            </w:pPr>
+            <w:r>
+              <w:rPr>
+                <w:rFonts w:ascii="Calibri" w:cs="Calibri" w:eastAsia="Calibri" w:hAnsi="Calibri"/>
+                <w:b w:val="false"/>
+                <w:bCs w:val="false"/>
+                <w:color w:val="5A4D42"/>
+                <w:sz w:val="19"/>
+                <w:szCs w:val="19"/>
+              </w:rPr>
+              <w:t xml:space="preserve">Teaches the assistant to write in the owner's own voice</w:t>
+            </w:r>
+          </w:p>
+        </w:tc>
+        <w:tc>
+          <w:tcPr>
+            <w:tcW w:type="dxa" w:w="1900"/>
+            <w:tcBorders>
+              <w:top w:val="single" w:color="E2D9C9" w:sz="4"/>
+              <w:left w:val="single" w:color="E2D9C9" w:sz="4"/>
+              <w:bottom w:val="single" w:color="E2D9C9" w:sz="4"/>
+              <w:right w:val="single" w:color="E2D9C9" w:sz="4"/>
+            </w:tcBorders>
+            <w:tcMar>
+              <w:top w:type="dxa" w:w="70"/>
+              <w:left w:type="dxa" w:w="100"/>
+              <w:bottom w:type="dxa" w:w="70"/>
+              <w:right w:type="dxa" w:w="100"/>
+            </w:tcMar>
+          </w:tcPr>
+          <w:p>
+            <w:pPr>
+              <w:jc w:val="left"/>
+            </w:pPr>
+            <w:r>
+              <w:rPr>
+                <w:rFonts w:ascii="Calibri" w:cs="Calibri" w:eastAsia="Calibri" w:hAnsi="Calibri"/>
+                <w:b w:val="false"/>
+                <w:bCs w:val="false"/>
+                <w:color w:val="211A16"/>
+                <w:sz w:val="19"/>
+                <w:szCs w:val="19"/>
+              </w:rPr>
+              <w:t xml:space="preserve">Paul</w:t>
+            </w:r>
+          </w:p>
+        </w:tc>
+        <w:tc>
+          <w:tcPr>
+            <w:tcW w:type="dxa" w:w="1900"/>
+            <w:tcBorders>
+              <w:top w:val="single" w:color="E2D9C9" w:sz="4"/>
+              <w:left w:val="single" w:color="E2D9C9" w:sz="4"/>
+              <w:bottom w:val="single" w:color="E2D9C9" w:sz="4"/>
+              <w:right w:val="single" w:color="E2D9C9" w:sz="4"/>
+            </w:tcBorders>
+            <w:tcMar>
+              <w:top w:type="dxa" w:w="70"/>
+              <w:left w:type="dxa" w:w="100"/>
+              <w:bottom w:type="dxa" w:w="70"/>
+              <w:right w:type="dxa" w:w="100"/>
+            </w:tcMar>
+          </w:tcPr>
+          <w:p>
+            <w:pPr>
+              <w:jc w:val="left"/>
+            </w:pPr>
+            <w:r>
+              <w:rPr>
+                <w:rFonts w:ascii="Calibri" w:cs="Calibri" w:eastAsia="Calibri" w:hAnsi="Calibri"/>
+                <w:b w:val="false"/>
+                <w:bCs w:val="false"/>
+                <w:color w:val="211A16"/>
+                <w:sz w:val="19"/>
+                <w:szCs w:val="19"/>
+              </w:rPr>
+              <w:t xml:space="preserve">Build</w:t>
+            </w:r>
+          </w:p>
+        </w:tc>
+        <w:tc>
+          <w:tcPr>
+            <w:tcW w:type="dxa" w:w="1300"/>
+            <w:tcBorders>
+              <w:top w:val="single" w:color="E2D9C9" w:sz="4"/>
+              <w:left w:val="single" w:color="E2D9C9" w:sz="4"/>
+              <w:bottom w:val="single" w:color="E2D9C9" w:sz="4"/>
+              <w:right w:val="single" w:color="E2D9C9" w:sz="4"/>
+            </w:tcBorders>
+            <w:tcMar>
+              <w:top w:type="dxa" w:w="70"/>
+              <w:left w:type="dxa" w:w="100"/>
+              <w:bottom w:type="dxa" w:w="70"/>
+              <w:right w:type="dxa" w:w="100"/>
+            </w:tcMar>
+          </w:tcPr>
+          <w:p>
+            <w:pPr>
+              <w:jc w:val="center"/>
+            </w:pPr>
+            <w:r>
+              <w:rPr>
+                <w:rFonts w:ascii="Calibri" w:cs="Calibri" w:eastAsia="Calibri" w:hAnsi="Calibri"/>
+                <w:b w:val="false"/>
+                <w:bCs w:val="false"/>
+                <w:color w:val="211A16"/>
+                <w:sz w:val="26"/>
+                <w:szCs w:val="26"/>
+              </w:rPr>
+              <w:t xml:space="preserve">☐</w:t>
+            </w:r>
+          </w:p>
+        </w:tc>
+      </w:tr>
+      <w:tr>
+        <w:trPr>
+          <w:cantSplit/>
+        </w:trPr>
+        <w:tc>
+          <w:tcPr>
+            <w:tcW w:type="dxa" w:w="4800"/>
+            <w:tcBorders>
+              <w:top w:val="single" w:color="E2D9C9" w:sz="4"/>
+              <w:left w:val="single" w:color="E2D9C9" w:sz="4"/>
+              <w:bottom w:val="single" w:color="E2D9C9" w:sz="4"/>
+              <w:right w:val="single" w:color="E2D9C9" w:sz="4"/>
+            </w:tcBorders>
+            <w:shd w:fill="FBF8F2" w:color="auto" w:val="clear"/>
+            <w:tcMar>
+              <w:top w:type="dxa" w:w="70"/>
+              <w:left w:type="dxa" w:w="100"/>
+              <w:bottom w:type="dxa" w:w="70"/>
+              <w:right w:type="dxa" w:w="100"/>
+            </w:tcMar>
+          </w:tcPr>
+          <w:p>
+            <w:pPr>
+              <w:jc w:val="left"/>
+            </w:pPr>
+            <w:r>
+              <w:rPr>
+                <w:rFonts w:ascii="Calibri" w:cs="Calibri" w:eastAsia="Calibri" w:hAnsi="Calibri"/>
+                <w:b w:val="false"/>
+                <w:bCs w:val="false"/>
+                <w:color w:val="211A16"/>
+                <w:sz w:val="19"/>
+                <w:szCs w:val="19"/>
+              </w:rPr>
+              <w:t xml:space="preserve">The owner's email signature (name, title, phone, website)</w:t>
+            </w:r>
+          </w:p>
+        </w:tc>
+        <w:tc>
+          <w:tcPr>
+            <w:tcW w:type="dxa" w:w="3900"/>
+            <w:tcBorders>
+              <w:top w:val="single" w:color="E2D9C9" w:sz="4"/>
+              <w:left w:val="single" w:color="E2D9C9" w:sz="4"/>
+              <w:bottom w:val="single" w:color="E2D9C9" w:sz="4"/>
+              <w:right w:val="single" w:color="E2D9C9" w:sz="4"/>
+            </w:tcBorders>
+            <w:shd w:fill="FBF8F2" w:color="auto" w:val="clear"/>
+            <w:tcMar>
+              <w:top w:type="dxa" w:w="70"/>
+              <w:left w:type="dxa" w:w="100"/>
+              <w:bottom w:type="dxa" w:w="70"/>
+              <w:right w:type="dxa" w:w="100"/>
+            </w:tcMar>
+          </w:tcPr>
+          <w:p>
+            <w:pPr>
+              <w:jc w:val="left"/>
+            </w:pPr>
+            <w:r>
+              <w:rPr>
+                <w:rFonts w:ascii="Calibri" w:cs="Calibri" w:eastAsia="Calibri" w:hAnsi="Calibri"/>
+                <w:b w:val="false"/>
+                <w:bCs w:val="false"/>
+                <w:color w:val="5A4D42"/>
+                <w:sz w:val="19"/>
+                <w:szCs w:val="19"/>
+              </w:rPr>
+              <w:t xml:space="preserve">Added to every drafted reply</w:t>
+            </w:r>
+          </w:p>
+        </w:tc>
+        <w:tc>
+          <w:tcPr>
+            <w:tcW w:type="dxa" w:w="1900"/>
+            <w:tcBorders>
+              <w:top w:val="single" w:color="E2D9C9" w:sz="4"/>
+              <w:left w:val="single" w:color="E2D9C9" w:sz="4"/>
+              <w:bottom w:val="single" w:color="E2D9C9" w:sz="4"/>
+              <w:right w:val="single" w:color="E2D9C9" w:sz="4"/>
+            </w:tcBorders>
+            <w:shd w:fill="FBF8F2" w:color="auto" w:val="clear"/>
+            <w:tcMar>
+              <w:top w:type="dxa" w:w="70"/>
+              <w:left w:type="dxa" w:w="100"/>
+              <w:bottom w:type="dxa" w:w="70"/>
+              <w:right w:type="dxa" w:w="100"/>
+            </w:tcMar>
+          </w:tcPr>
+          <w:p>
+            <w:pPr>
+              <w:jc w:val="left"/>
+            </w:pPr>
+            <w:r>
+              <w:rPr>
+                <w:rFonts w:ascii="Calibri" w:cs="Calibri" w:eastAsia="Calibri" w:hAnsi="Calibri"/>
+                <w:b w:val="false"/>
+                <w:bCs w:val="false"/>
+                <w:color w:val="211A16"/>
+                <w:sz w:val="19"/>
+                <w:szCs w:val="19"/>
+              </w:rPr>
+              <w:t xml:space="preserve">Paul</w:t>
+            </w:r>
+          </w:p>
+        </w:tc>
+        <w:tc>
+          <w:tcPr>
+            <w:tcW w:type="dxa" w:w="1900"/>
+            <w:tcBorders>
+              <w:top w:val="single" w:color="E2D9C9" w:sz="4"/>
+              <w:left w:val="single" w:color="E2D9C9" w:sz="4"/>
+              <w:bottom w:val="single" w:color="E2D9C9" w:sz="4"/>
+              <w:right w:val="single" w:color="E2D9C9" w:sz="4"/>
+            </w:tcBorders>
+            <w:shd w:fill="FBF8F2" w:color="auto" w:val="clear"/>
+            <w:tcMar>
+              <w:top w:type="dxa" w:w="70"/>
+              <w:left w:type="dxa" w:w="100"/>
+              <w:bottom w:type="dxa" w:w="70"/>
+              <w:right w:type="dxa" w:w="100"/>
+            </w:tcMar>
+          </w:tcPr>
+          <w:p>
+            <w:pPr>
+              <w:jc w:val="left"/>
+            </w:pPr>
+            <w:r>
+              <w:rPr>
+                <w:rFonts w:ascii="Calibri" w:cs="Calibri" w:eastAsia="Calibri" w:hAnsi="Calibri"/>
+                <w:b w:val="false"/>
+                <w:bCs w:val="false"/>
+                <w:color w:val="211A16"/>
+                <w:sz w:val="19"/>
+                <w:szCs w:val="19"/>
+              </w:rPr>
+              <w:t xml:space="preserve">Build</w:t>
+            </w:r>
+          </w:p>
+        </w:tc>
+        <w:tc>
+          <w:tcPr>
+            <w:tcW w:type="dxa" w:w="1300"/>
+            <w:tcBorders>
+              <w:top w:val="single" w:color="E2D9C9" w:sz="4"/>
+              <w:left w:val="single" w:color="E2D9C9" w:sz="4"/>
+              <w:bottom w:val="single" w:color="E2D9C9" w:sz="4"/>
+              <w:right w:val="single" w:color="E2D9C9" w:sz="4"/>
+            </w:tcBorders>
+            <w:shd w:fill="FBF8F2" w:color="auto" w:val="clear"/>
+            <w:tcMar>
+              <w:top w:type="dxa" w:w="70"/>
+              <w:left w:type="dxa" w:w="100"/>
+              <w:bottom w:type="dxa" w:w="70"/>
+              <w:right w:type="dxa" w:w="100"/>
+            </w:tcMar>
+          </w:tcPr>
+          <w:p>
+            <w:pPr>
+              <w:jc w:val="center"/>
+            </w:pPr>
+            <w:r>
+              <w:rPr>
+                <w:rFonts w:ascii="Calibri" w:cs="Calibri" w:eastAsia="Calibri" w:hAnsi="Calibri"/>
+                <w:b w:val="false"/>
+                <w:bCs w:val="false"/>
+                <w:color w:val="211A16"/>
+                <w:sz w:val="26"/>
+                <w:szCs w:val="26"/>
+              </w:rPr>
+              <w:t xml:space="preserve">☐</w:t>
+            </w:r>
+          </w:p>
+        </w:tc>
+      </w:tr>
+      <w:tr>
+        <w:trPr>
+          <w:cantSplit/>
+        </w:trPr>
+        <w:tc>
+          <w:tcPr>
+            <w:tcW w:type="dxa" w:w="4800"/>
+            <w:tcBorders>
+              <w:top w:val="single" w:color="E2D9C9" w:sz="4"/>
+              <w:left w:val="single" w:color="E2D9C9" w:sz="4"/>
+              <w:bottom w:val="single" w:color="E2D9C9" w:sz="4"/>
+              <w:right w:val="single" w:color="E2D9C9" w:sz="4"/>
+            </w:tcBorders>
+            <w:tcMar>
+              <w:top w:type="dxa" w:w="70"/>
+              <w:left w:type="dxa" w:w="100"/>
+              <w:bottom w:type="dxa" w:w="70"/>
+              <w:right w:type="dxa" w:w="100"/>
+            </w:tcMar>
+          </w:tcPr>
+          <w:p>
+            <w:pPr>
+              <w:jc w:val="left"/>
+            </w:pPr>
+            <w:r>
+              <w:rPr>
+                <w:rFonts w:ascii="Calibri" w:cs="Calibri" w:eastAsia="Calibri" w:hAnsi="Calibri"/>
+                <w:b w:val="false"/>
+                <w:bCs w:val="false"/>
+                <w:color w:val="211A16"/>
+                <w:sz w:val="19"/>
+                <w:szCs w:val="19"/>
+              </w:rPr>
+              <w:t xml:space="preserve">Standard answers to common questions: process, timeline, service area, warranty, how pricing works, what to prepare before a visit</w:t>
+            </w:r>
+          </w:p>
+        </w:tc>
+        <w:tc>
+          <w:tcPr>
+            <w:tcW w:type="dxa" w:w="3900"/>
+            <w:tcBorders>
+              <w:top w:val="single" w:color="E2D9C9" w:sz="4"/>
+              <w:left w:val="single" w:color="E2D9C9" w:sz="4"/>
+              <w:bottom w:val="single" w:color="E2D9C9" w:sz="4"/>
+              <w:right w:val="single" w:color="E2D9C9" w:sz="4"/>
+            </w:tcBorders>
+            <w:tcMar>
+              <w:top w:type="dxa" w:w="70"/>
+              <w:left w:type="dxa" w:w="100"/>
+              <w:bottom w:type="dxa" w:w="70"/>
+              <w:right w:type="dxa" w:w="100"/>
+            </w:tcMar>
+          </w:tcPr>
+          <w:p>
+            <w:pPr>
+              <w:jc w:val="left"/>
+            </w:pPr>
+            <w:r>
+              <w:rPr>
+                <w:rFonts w:ascii="Calibri" w:cs="Calibri" w:eastAsia="Calibri" w:hAnsi="Calibri"/>
+                <w:b w:val="false"/>
+                <w:bCs w:val="false"/>
+                <w:color w:val="5A4D42"/>
+                <w:sz w:val="19"/>
+                <w:szCs w:val="19"/>
+              </w:rPr>
+              <w:t xml:space="preserve">Lets the assistant draft accurate replies instead of guessing</w:t>
+            </w:r>
+          </w:p>
+        </w:tc>
+        <w:tc>
+          <w:tcPr>
+            <w:tcW w:type="dxa" w:w="1900"/>
+            <w:tcBorders>
+              <w:top w:val="single" w:color="E2D9C9" w:sz="4"/>
+              <w:left w:val="single" w:color="E2D9C9" w:sz="4"/>
+              <w:bottom w:val="single" w:color="E2D9C9" w:sz="4"/>
+              <w:right w:val="single" w:color="E2D9C9" w:sz="4"/>
+            </w:tcBorders>
+            <w:tcMar>
+              <w:top w:type="dxa" w:w="70"/>
+              <w:left w:type="dxa" w:w="100"/>
+              <w:bottom w:type="dxa" w:w="70"/>
+              <w:right w:type="dxa" w:w="100"/>
+            </w:tcMar>
+          </w:tcPr>
+          <w:p>
+            <w:pPr>
+              <w:jc w:val="left"/>
+            </w:pPr>
+            <w:r>
+              <w:rPr>
+                <w:rFonts w:ascii="Calibri" w:cs="Calibri" w:eastAsia="Calibri" w:hAnsi="Calibri"/>
+                <w:b w:val="false"/>
+                <w:bCs w:val="false"/>
+                <w:color w:val="211A16"/>
+                <w:sz w:val="19"/>
+                <w:szCs w:val="19"/>
+              </w:rPr>
+              <w:t xml:space="preserve">Paul / Madison</w:t>
+            </w:r>
+          </w:p>
+        </w:tc>
+        <w:tc>
+          <w:tcPr>
+            <w:tcW w:type="dxa" w:w="1900"/>
+            <w:tcBorders>
+              <w:top w:val="single" w:color="E2D9C9" w:sz="4"/>
+              <w:left w:val="single" w:color="E2D9C9" w:sz="4"/>
+              <w:bottom w:val="single" w:color="E2D9C9" w:sz="4"/>
+              <w:right w:val="single" w:color="E2D9C9" w:sz="4"/>
+            </w:tcBorders>
+            <w:tcMar>
+              <w:top w:type="dxa" w:w="70"/>
+              <w:left w:type="dxa" w:w="100"/>
+              <w:bottom w:type="dxa" w:w="70"/>
+              <w:right w:type="dxa" w:w="100"/>
+            </w:tcMar>
+          </w:tcPr>
+          <w:p>
+            <w:pPr>
+              <w:jc w:val="left"/>
+            </w:pPr>
+            <w:r>
+              <w:rPr>
+                <w:rFonts w:ascii="Calibri" w:cs="Calibri" w:eastAsia="Calibri" w:hAnsi="Calibri"/>
+                <w:b w:val="false"/>
+                <w:bCs w:val="false"/>
+                <w:color w:val="211A16"/>
+                <w:sz w:val="19"/>
+                <w:szCs w:val="19"/>
+              </w:rPr>
+              <w:t xml:space="preserve">Build</w:t>
+            </w:r>
+          </w:p>
+        </w:tc>
+        <w:tc>
+          <w:tcPr>
+            <w:tcW w:type="dxa" w:w="1300"/>
+            <w:tcBorders>
+              <w:top w:val="single" w:color="E2D9C9" w:sz="4"/>
+              <w:left w:val="single" w:color="E2D9C9" w:sz="4"/>
+              <w:bottom w:val="single" w:color="E2D9C9" w:sz="4"/>
+              <w:right w:val="single" w:color="E2D9C9" w:sz="4"/>
+            </w:tcBorders>
+            <w:tcMar>
+              <w:top w:type="dxa" w:w="70"/>
+              <w:left w:type="dxa" w:w="100"/>
+              <w:bottom w:type="dxa" w:w="70"/>
+              <w:right w:type="dxa" w:w="100"/>
+            </w:tcMar>
+          </w:tcPr>
+          <w:p>
+            <w:pPr>
+              <w:jc w:val="center"/>
+            </w:pPr>
+            <w:r>
+              <w:rPr>
+                <w:rFonts w:ascii="Calibri" w:cs="Calibri" w:eastAsia="Calibri" w:hAnsi="Calibri"/>
+                <w:b w:val="false"/>
+                <w:bCs w:val="false"/>
+                <w:color w:val="211A16"/>
+                <w:sz w:val="26"/>
+                <w:szCs w:val="26"/>
+              </w:rPr>
+              <w:t xml:space="preserve">☐</w:t>
+            </w:r>
+          </w:p>
+        </w:tc>
+      </w:tr>
+      <w:tr>
+        <w:trPr>
+          <w:cantSplit/>
+        </w:trPr>
+        <w:tc>
+          <w:tcPr>
+            <w:tcW w:type="dxa" w:w="4800"/>
+            <w:tcBorders>
+              <w:top w:val="single" w:color="E2D9C9" w:sz="4"/>
+              <w:left w:val="single" w:color="E2D9C9" w:sz="4"/>
+              <w:bottom w:val="single" w:color="E2D9C9" w:sz="4"/>
+              <w:right w:val="single" w:color="E2D9C9" w:sz="4"/>
+            </w:tcBorders>
+            <w:shd w:fill="FBF8F2" w:color="auto" w:val="clear"/>
+            <w:tcMar>
+              <w:top w:type="dxa" w:w="70"/>
+              <w:left w:type="dxa" w:w="100"/>
+              <w:bottom w:type="dxa" w:w="70"/>
+              <w:right w:type="dxa" w:w="100"/>
+            </w:tcMar>
+          </w:tcPr>
+          <w:p>
+            <w:pPr>
+              <w:jc w:val="left"/>
+            </w:pPr>
+            <w:r>
+              <w:rPr>
+                <w:rFonts w:ascii="Calibri" w:cs="Calibri" w:eastAsia="Calibri" w:hAnsi="Calibri"/>
+                <w:b w:val="false"/>
+                <w:bCs w:val="false"/>
+                <w:color w:val="211A16"/>
+                <w:sz w:val="19"/>
+                <w:szCs w:val="19"/>
+              </w:rPr>
+              <w:t xml:space="preserve">Topics the assistant must never answer by itself, even as a draft (for example exact prices, contract changes, complaints, legal matters)</w:t>
+            </w:r>
+          </w:p>
+        </w:tc>
+        <w:tc>
+          <w:tcPr>
+            <w:tcW w:type="dxa" w:w="3900"/>
+            <w:tcBorders>
+              <w:top w:val="single" w:color="E2D9C9" w:sz="4"/>
+              <w:left w:val="single" w:color="E2D9C9" w:sz="4"/>
+              <w:bottom w:val="single" w:color="E2D9C9" w:sz="4"/>
+              <w:right w:val="single" w:color="E2D9C9" w:sz="4"/>
+            </w:tcBorders>
+            <w:shd w:fill="FBF8F2" w:color="auto" w:val="clear"/>
+            <w:tcMar>
+              <w:top w:type="dxa" w:w="70"/>
+              <w:left w:type="dxa" w:w="100"/>
+              <w:bottom w:type="dxa" w:w="70"/>
+              <w:right w:type="dxa" w:w="100"/>
+            </w:tcMar>
+          </w:tcPr>
+          <w:p>
+            <w:pPr>
+              <w:jc w:val="left"/>
+            </w:pPr>
+            <w:r>
+              <w:rPr>
+                <w:rFonts w:ascii="Calibri" w:cs="Calibri" w:eastAsia="Calibri" w:hAnsi="Calibri"/>
+                <w:b w:val="false"/>
+                <w:bCs w:val="false"/>
+                <w:color w:val="5A4D42"/>
+                <w:sz w:val="19"/>
+                <w:szCs w:val="19"/>
+              </w:rPr>
+              <w:t xml:space="preserve">Keeps sensitive replies with a human</w:t>
+            </w:r>
+          </w:p>
+        </w:tc>
+        <w:tc>
+          <w:tcPr>
+            <w:tcW w:type="dxa" w:w="1900"/>
+            <w:tcBorders>
+              <w:top w:val="single" w:color="E2D9C9" w:sz="4"/>
+              <w:left w:val="single" w:color="E2D9C9" w:sz="4"/>
+              <w:bottom w:val="single" w:color="E2D9C9" w:sz="4"/>
+              <w:right w:val="single" w:color="E2D9C9" w:sz="4"/>
+            </w:tcBorders>
+            <w:shd w:fill="FBF8F2" w:color="auto" w:val="clear"/>
+            <w:tcMar>
+              <w:top w:type="dxa" w:w="70"/>
+              <w:left w:type="dxa" w:w="100"/>
+              <w:bottom w:type="dxa" w:w="70"/>
+              <w:right w:type="dxa" w:w="100"/>
+            </w:tcMar>
+          </w:tcPr>
+          <w:p>
+            <w:pPr>
+              <w:jc w:val="left"/>
+            </w:pPr>
+            <w:r>
+              <w:rPr>
+                <w:rFonts w:ascii="Calibri" w:cs="Calibri" w:eastAsia="Calibri" w:hAnsi="Calibri"/>
+                <w:b w:val="false"/>
+                <w:bCs w:val="false"/>
+                <w:color w:val="211A16"/>
+                <w:sz w:val="19"/>
+                <w:szCs w:val="19"/>
+              </w:rPr>
+              <w:t xml:space="preserve">Paul</w:t>
+            </w:r>
+          </w:p>
+        </w:tc>
+        <w:tc>
+          <w:tcPr>
+            <w:tcW w:type="dxa" w:w="1900"/>
+            <w:tcBorders>
+              <w:top w:val="single" w:color="E2D9C9" w:sz="4"/>
+              <w:left w:val="single" w:color="E2D9C9" w:sz="4"/>
+              <w:bottom w:val="single" w:color="E2D9C9" w:sz="4"/>
+              <w:right w:val="single" w:color="E2D9C9" w:sz="4"/>
+            </w:tcBorders>
+            <w:shd w:fill="FBF8F2" w:color="auto" w:val="clear"/>
+            <w:tcMar>
+              <w:top w:type="dxa" w:w="70"/>
+              <w:left w:type="dxa" w:w="100"/>
+              <w:bottom w:type="dxa" w:w="70"/>
+              <w:right w:type="dxa" w:w="100"/>
+            </w:tcMar>
+          </w:tcPr>
+          <w:p>
+            <w:pPr>
+              <w:jc w:val="left"/>
+            </w:pPr>
+            <w:r>
+              <w:rPr>
+                <w:rFonts w:ascii="Calibri" w:cs="Calibri" w:eastAsia="Calibri" w:hAnsi="Calibri"/>
+                <w:b w:val="false"/>
+                <w:bCs w:val="false"/>
+                <w:color w:val="211A16"/>
+                <w:sz w:val="19"/>
+                <w:szCs w:val="19"/>
+              </w:rPr>
+              <w:t xml:space="preserve">Build</w:t>
+            </w:r>
+          </w:p>
+        </w:tc>
+        <w:tc>
+          <w:tcPr>
+            <w:tcW w:type="dxa" w:w="1300"/>
+            <w:tcBorders>
+              <w:top w:val="single" w:color="E2D9C9" w:sz="4"/>
+              <w:left w:val="single" w:color="E2D9C9" w:sz="4"/>
+              <w:bottom w:val="single" w:color="E2D9C9" w:sz="4"/>
+              <w:right w:val="single" w:color="E2D9C9" w:sz="4"/>
+            </w:tcBorders>
+            <w:shd w:fill="FBF8F2" w:color="auto" w:val="clear"/>
+            <w:tcMar>
+              <w:top w:type="dxa" w:w="70"/>
+              <w:left w:type="dxa" w:w="100"/>
+              <w:bottom w:type="dxa" w:w="70"/>
+              <w:right w:type="dxa" w:w="100"/>
+            </w:tcMar>
+          </w:tcPr>
+          <w:p>
+            <w:pPr>
+              <w:jc w:val="center"/>
+            </w:pPr>
+            <w:r>
+              <w:rPr>
+                <w:rFonts w:ascii="Calibri" w:cs="Calibri" w:eastAsia="Calibri" w:hAnsi="Calibri"/>
+                <w:b w:val="false"/>
+                <w:bCs w:val="false"/>
+                <w:color w:val="211A16"/>
+                <w:sz w:val="26"/>
+                <w:szCs w:val="26"/>
+              </w:rPr>
+              <w:t xml:space="preserve">☐</w:t>
+            </w:r>
+          </w:p>
+        </w:tc>
+      </w:tr>
+      <w:tr>
+        <w:trPr>
+          <w:cantSplit/>
+        </w:trPr>
+        <w:tc>
+          <w:tcPr>
+            <w:tcW w:type="dxa" w:w="4800"/>
+            <w:tcBorders>
+              <w:top w:val="single" w:color="E2D9C9" w:sz="4"/>
+              <w:left w:val="single" w:color="E2D9C9" w:sz="4"/>
+              <w:bottom w:val="single" w:color="E2D9C9" w:sz="4"/>
+              <w:right w:val="single" w:color="E2D9C9" w:sz="4"/>
+            </w:tcBorders>
+            <w:tcMar>
+              <w:top w:type="dxa" w:w="70"/>
+              <w:left w:type="dxa" w:w="100"/>
+              <w:bottom w:type="dxa" w:w="70"/>
+              <w:right w:type="dxa" w:w="100"/>
+            </w:tcMar>
+          </w:tcPr>
+          <w:p>
+            <w:pPr>
+              <w:jc w:val="left"/>
+            </w:pPr>
+            <w:r>
+              <w:rPr>
+                <w:rFonts w:ascii="Calibri" w:cs="Calibri" w:eastAsia="Calibri" w:hAnsi="Calibri"/>
+                <w:b w:val="false"/>
+                <w:bCs w:val="false"/>
+                <w:color w:val="211A16"/>
+                <w:sz w:val="19"/>
+                <w:szCs w:val="19"/>
+              </w:rPr>
+              <w:t xml:space="preserve">Business hours and response-time promises (for example reply within one business day)</w:t>
+            </w:r>
+          </w:p>
+        </w:tc>
+        <w:tc>
+          <w:tcPr>
+            <w:tcW w:type="dxa" w:w="3900"/>
+            <w:tcBorders>
+              <w:top w:val="single" w:color="E2D9C9" w:sz="4"/>
+              <w:left w:val="single" w:color="E2D9C9" w:sz="4"/>
+              <w:bottom w:val="single" w:color="E2D9C9" w:sz="4"/>
+              <w:right w:val="single" w:color="E2D9C9" w:sz="4"/>
+            </w:tcBorders>
+            <w:tcMar>
+              <w:top w:type="dxa" w:w="70"/>
+              <w:left w:type="dxa" w:w="100"/>
+              <w:bottom w:type="dxa" w:w="70"/>
+              <w:right w:type="dxa" w:w="100"/>
+            </w:tcMar>
+          </w:tcPr>
+          <w:p>
+            <w:pPr>
+              <w:jc w:val="left"/>
+            </w:pPr>
+            <w:r>
+              <w:rPr>
+                <w:rFonts w:ascii="Calibri" w:cs="Calibri" w:eastAsia="Calibri" w:hAnsi="Calibri"/>
+                <w:b w:val="false"/>
+                <w:bCs w:val="false"/>
+                <w:color w:val="5A4D42"/>
+                <w:sz w:val="19"/>
+                <w:szCs w:val="19"/>
+              </w:rPr>
+              <w:t xml:space="preserve">Used for urgency and wording</w:t>
+            </w:r>
+          </w:p>
+        </w:tc>
+        <w:tc>
+          <w:tcPr>
+            <w:tcW w:type="dxa" w:w="1900"/>
+            <w:tcBorders>
+              <w:top w:val="single" w:color="E2D9C9" w:sz="4"/>
+              <w:left w:val="single" w:color="E2D9C9" w:sz="4"/>
+              <w:bottom w:val="single" w:color="E2D9C9" w:sz="4"/>
+              <w:right w:val="single" w:color="E2D9C9" w:sz="4"/>
+            </w:tcBorders>
+            <w:tcMar>
+              <w:top w:type="dxa" w:w="70"/>
+              <w:left w:type="dxa" w:w="100"/>
+              <w:bottom w:type="dxa" w:w="70"/>
+              <w:right w:type="dxa" w:w="100"/>
+            </w:tcMar>
+          </w:tcPr>
+          <w:p>
+            <w:pPr>
+              <w:jc w:val="left"/>
+            </w:pPr>
+            <w:r>
+              <w:rPr>
+                <w:rFonts w:ascii="Calibri" w:cs="Calibri" w:eastAsia="Calibri" w:hAnsi="Calibri"/>
+                <w:b w:val="false"/>
+                <w:bCs w:val="false"/>
+                <w:color w:val="211A16"/>
+                <w:sz w:val="19"/>
+                <w:szCs w:val="19"/>
+              </w:rPr>
+              <w:t xml:space="preserve">Paul / Madison</w:t>
+            </w:r>
+          </w:p>
+        </w:tc>
+        <w:tc>
+          <w:tcPr>
+            <w:tcW w:type="dxa" w:w="1900"/>
+            <w:tcBorders>
+              <w:top w:val="single" w:color="E2D9C9" w:sz="4"/>
+              <w:left w:val="single" w:color="E2D9C9" w:sz="4"/>
+              <w:bottom w:val="single" w:color="E2D9C9" w:sz="4"/>
+              <w:right w:val="single" w:color="E2D9C9" w:sz="4"/>
+            </w:tcBorders>
+            <w:tcMar>
+              <w:top w:type="dxa" w:w="70"/>
+              <w:left w:type="dxa" w:w="100"/>
+              <w:bottom w:type="dxa" w:w="70"/>
+              <w:right w:type="dxa" w:w="100"/>
+            </w:tcMar>
+          </w:tcPr>
+          <w:p>
+            <w:pPr>
+              <w:jc w:val="left"/>
+            </w:pPr>
+            <w:r>
+              <w:rPr>
+                <w:rFonts w:ascii="Calibri" w:cs="Calibri" w:eastAsia="Calibri" w:hAnsi="Calibri"/>
+                <w:b w:val="false"/>
+                <w:bCs w:val="false"/>
+                <w:color w:val="211A16"/>
+                <w:sz w:val="19"/>
+                <w:szCs w:val="19"/>
+              </w:rPr>
+              <w:t xml:space="preserve">Build</w:t>
+            </w:r>
+          </w:p>
+        </w:tc>
+        <w:tc>
+          <w:tcPr>
+            <w:tcW w:type="dxa" w:w="1300"/>
+            <w:tcBorders>
+              <w:top w:val="single" w:color="E2D9C9" w:sz="4"/>
+              <w:left w:val="single" w:color="E2D9C9" w:sz="4"/>
+              <w:bottom w:val="single" w:color="E2D9C9" w:sz="4"/>
+              <w:right w:val="single" w:color="E2D9C9" w:sz="4"/>
+            </w:tcBorders>
+            <w:tcMar>
+              <w:top w:type="dxa" w:w="70"/>
+              <w:left w:type="dxa" w:w="100"/>
+              <w:bottom w:type="dxa" w:w="70"/>
+              <w:right w:type="dxa" w:w="100"/>
+            </w:tcMar>
+          </w:tcPr>
+          <w:p>
+            <w:pPr>
+              <w:jc w:val="center"/>
+            </w:pPr>
+            <w:r>
+              <w:rPr>
+                <w:rFonts w:ascii="Calibri" w:cs="Calibri" w:eastAsia="Calibri" w:hAnsi="Calibri"/>
+                <w:b w:val="false"/>
+                <w:bCs w:val="false"/>
+                <w:color w:val="211A16"/>
+                <w:sz w:val="26"/>
+                <w:szCs w:val="26"/>
+              </w:rPr>
+              <w:t xml:space="preserve">☐</w:t>
+            </w:r>
+          </w:p>
+        </w:tc>
+      </w:tr>
+      <w:tr>
+        <w:trPr>
+          <w:cantSplit/>
+        </w:trPr>
+        <w:tc>
+          <w:tcPr>
+            <w:tcW w:type="dxa" w:w="4800"/>
+            <w:tcBorders>
+              <w:top w:val="single" w:color="E2D9C9" w:sz="4"/>
+              <w:left w:val="single" w:color="E2D9C9" w:sz="4"/>
+              <w:bottom w:val="single" w:color="E2D9C9" w:sz="4"/>
+              <w:right w:val="single" w:color="E2D9C9" w:sz="4"/>
+            </w:tcBorders>
+            <w:shd w:fill="FBF8F2" w:color="auto" w:val="clear"/>
+            <w:tcMar>
+              <w:top w:type="dxa" w:w="70"/>
+              <w:left w:type="dxa" w:w="100"/>
+              <w:bottom w:type="dxa" w:w="70"/>
+              <w:right w:type="dxa" w:w="100"/>
+            </w:tcMar>
+          </w:tcPr>
+          <w:p>
+            <w:pPr>
+              <w:jc w:val="left"/>
+            </w:pPr>
+            <w:r>
+              <w:rPr>
+                <w:rFonts w:ascii="Calibri" w:cs="Calibri" w:eastAsia="Calibri" w:hAnsi="Calibri"/>
+                <w:b w:val="false"/>
+                <w:bCs w:val="false"/>
+                <w:color w:val="211A16"/>
+                <w:sz w:val="19"/>
+                <w:szCs w:val="19"/>
+              </w:rPr>
+              <w:t xml:space="preserve">Who should receive the daily summary email and what time it should arrive</w:t>
+            </w:r>
+          </w:p>
+        </w:tc>
+        <w:tc>
+          <w:tcPr>
+            <w:tcW w:type="dxa" w:w="3900"/>
+            <w:tcBorders>
+              <w:top w:val="single" w:color="E2D9C9" w:sz="4"/>
+              <w:left w:val="single" w:color="E2D9C9" w:sz="4"/>
+              <w:bottom w:val="single" w:color="E2D9C9" w:sz="4"/>
+              <w:right w:val="single" w:color="E2D9C9" w:sz="4"/>
+            </w:tcBorders>
+            <w:shd w:fill="FBF8F2" w:color="auto" w:val="clear"/>
+            <w:tcMar>
+              <w:top w:type="dxa" w:w="70"/>
+              <w:left w:type="dxa" w:w="100"/>
+              <w:bottom w:type="dxa" w:w="70"/>
+              <w:right w:type="dxa" w:w="100"/>
+            </w:tcMar>
+          </w:tcPr>
+          <w:p>
+            <w:pPr>
+              <w:jc w:val="left"/>
+            </w:pPr>
+            <w:r>
+              <w:rPr>
+                <w:rFonts w:ascii="Calibri" w:cs="Calibri" w:eastAsia="Calibri" w:hAnsi="Calibri"/>
+                <w:b w:val="false"/>
+                <w:bCs w:val="false"/>
+                <w:color w:val="5A4D42"/>
+                <w:sz w:val="19"/>
+                <w:szCs w:val="19"/>
+              </w:rPr>
+              <w:t xml:space="preserve">Morning overview of what needs attention</w:t>
+            </w:r>
+          </w:p>
+        </w:tc>
+        <w:tc>
+          <w:tcPr>
+            <w:tcW w:type="dxa" w:w="1900"/>
+            <w:tcBorders>
+              <w:top w:val="single" w:color="E2D9C9" w:sz="4"/>
+              <w:left w:val="single" w:color="E2D9C9" w:sz="4"/>
+              <w:bottom w:val="single" w:color="E2D9C9" w:sz="4"/>
+              <w:right w:val="single" w:color="E2D9C9" w:sz="4"/>
+            </w:tcBorders>
+            <w:shd w:fill="FBF8F2" w:color="auto" w:val="clear"/>
+            <w:tcMar>
+              <w:top w:type="dxa" w:w="70"/>
+              <w:left w:type="dxa" w:w="100"/>
+              <w:bottom w:type="dxa" w:w="70"/>
+              <w:right w:type="dxa" w:w="100"/>
+            </w:tcMar>
+          </w:tcPr>
+          <w:p>
+            <w:pPr>
+              <w:jc w:val="left"/>
+            </w:pPr>
+            <w:r>
+              <w:rPr>
+                <w:rFonts w:ascii="Calibri" w:cs="Calibri" w:eastAsia="Calibri" w:hAnsi="Calibri"/>
+                <w:b w:val="false"/>
+                <w:bCs w:val="false"/>
+                <w:color w:val="211A16"/>
+                <w:sz w:val="19"/>
+                <w:szCs w:val="19"/>
+              </w:rPr>
+              <w:t xml:space="preserve">Paul / Madison</w:t>
+            </w:r>
+          </w:p>
+        </w:tc>
+        <w:tc>
+          <w:tcPr>
+            <w:tcW w:type="dxa" w:w="1900"/>
+            <w:tcBorders>
+              <w:top w:val="single" w:color="E2D9C9" w:sz="4"/>
+              <w:left w:val="single" w:color="E2D9C9" w:sz="4"/>
+              <w:bottom w:val="single" w:color="E2D9C9" w:sz="4"/>
+              <w:right w:val="single" w:color="E2D9C9" w:sz="4"/>
+            </w:tcBorders>
+            <w:shd w:fill="FBF8F2" w:color="auto" w:val="clear"/>
+            <w:tcMar>
+              <w:top w:type="dxa" w:w="70"/>
+              <w:left w:type="dxa" w:w="100"/>
+              <w:bottom w:type="dxa" w:w="70"/>
+              <w:right w:type="dxa" w:w="100"/>
+            </w:tcMar>
+          </w:tcPr>
+          <w:p>
+            <w:pPr>
+              <w:jc w:val="left"/>
+            </w:pPr>
+            <w:r>
+              <w:rPr>
+                <w:rFonts w:ascii="Calibri" w:cs="Calibri" w:eastAsia="Calibri" w:hAnsi="Calibri"/>
+                <w:b w:val="false"/>
+                <w:bCs w:val="false"/>
+                <w:color w:val="211A16"/>
+                <w:sz w:val="19"/>
+                <w:szCs w:val="19"/>
+              </w:rPr>
+              <w:t xml:space="preserve">Later</w:t>
+            </w:r>
+          </w:p>
+        </w:tc>
+        <w:tc>
+          <w:tcPr>
+            <w:tcW w:type="dxa" w:w="1300"/>
+            <w:tcBorders>
+              <w:top w:val="single" w:color="E2D9C9" w:sz="4"/>
+              <w:left w:val="single" w:color="E2D9C9" w:sz="4"/>
+              <w:bottom w:val="single" w:color="E2D9C9" w:sz="4"/>
+              <w:right w:val="single" w:color="E2D9C9" w:sz="4"/>
+            </w:tcBorders>
+            <w:shd w:fill="FBF8F2" w:color="auto" w:val="clear"/>
+            <w:tcMar>
+              <w:top w:type="dxa" w:w="70"/>
+              <w:left w:type="dxa" w:w="100"/>
+              <w:bottom w:type="dxa" w:w="70"/>
+              <w:right w:type="dxa" w:w="100"/>
+            </w:tcMar>
+          </w:tcPr>
+          <w:p>
+            <w:pPr>
+              <w:jc w:val="center"/>
+            </w:pPr>
+            <w:r>
+              <w:rPr>
+                <w:rFonts w:ascii="Calibri" w:cs="Calibri" w:eastAsia="Calibri" w:hAnsi="Calibri"/>
+                <w:b w:val="false"/>
+                <w:bCs w:val="false"/>
+                <w:color w:val="211A16"/>
+                <w:sz w:val="26"/>
+                <w:szCs w:val="26"/>
+              </w:rPr>
+              <w:t xml:space="preserve">☐</w:t>
+            </w:r>
+          </w:p>
+        </w:tc>
+      </w:tr>
+      <w:tr>
+        <w:trPr>
+          <w:cantSplit/>
+        </w:trPr>
+        <w:tc>
+          <w:tcPr>
+            <w:tcW w:type="dxa" w:w="4800"/>
+            <w:tcBorders>
+              <w:top w:val="single" w:color="E2D9C9" w:sz="4"/>
+              <w:left w:val="single" w:color="E2D9C9" w:sz="4"/>
+              <w:bottom w:val="single" w:color="E2D9C9" w:sz="4"/>
+              <w:right w:val="single" w:color="E2D9C9" w:sz="4"/>
+            </w:tcBorders>
+            <w:tcMar>
+              <w:top w:type="dxa" w:w="70"/>
+              <w:left w:type="dxa" w:w="100"/>
+              <w:bottom w:type="dxa" w:w="70"/>
+              <w:right w:type="dxa" w:w="100"/>
+            </w:tcMar>
+          </w:tcPr>
+          <w:p>
+            <w:pPr>
+              <w:jc w:val="left"/>
+            </w:pPr>
+            <w:r>
+              <w:rPr>
+                <w:rFonts w:ascii="Calibri" w:cs="Calibri" w:eastAsia="Calibri" w:hAnsi="Calibri"/>
+                <w:b w:val="false"/>
+                <w:bCs w:val="false"/>
+                <w:color w:val="211A16"/>
+                <w:sz w:val="19"/>
+                <w:szCs w:val="19"/>
+              </w:rPr>
+              <w:t xml:space="preserve">How long emails should be kept in the system</w:t>
+            </w:r>
+          </w:p>
+        </w:tc>
+        <w:tc>
+          <w:tcPr>
+            <w:tcW w:type="dxa" w:w="3900"/>
+            <w:tcBorders>
+              <w:top w:val="single" w:color="E2D9C9" w:sz="4"/>
+              <w:left w:val="single" w:color="E2D9C9" w:sz="4"/>
+              <w:bottom w:val="single" w:color="E2D9C9" w:sz="4"/>
+              <w:right w:val="single" w:color="E2D9C9" w:sz="4"/>
+            </w:tcBorders>
+            <w:tcMar>
+              <w:top w:type="dxa" w:w="70"/>
+              <w:left w:type="dxa" w:w="100"/>
+              <w:bottom w:type="dxa" w:w="70"/>
+              <w:right w:type="dxa" w:w="100"/>
+            </w:tcMar>
+          </w:tcPr>
+          <w:p>
+            <w:pPr>
+              <w:jc w:val="left"/>
+            </w:pPr>
+            <w:r>
+              <w:rPr>
+                <w:rFonts w:ascii="Calibri" w:cs="Calibri" w:eastAsia="Calibri" w:hAnsi="Calibri"/>
+                <w:b w:val="false"/>
+                <w:bCs w:val="false"/>
+                <w:color w:val="5A4D42"/>
+                <w:sz w:val="19"/>
+                <w:szCs w:val="19"/>
+              </w:rPr>
+              <w:t xml:space="preserve">Retention rule for stored emails</w:t>
+            </w:r>
+          </w:p>
+        </w:tc>
+        <w:tc>
+          <w:tcPr>
+            <w:tcW w:type="dxa" w:w="1900"/>
+            <w:tcBorders>
+              <w:top w:val="single" w:color="E2D9C9" w:sz="4"/>
+              <w:left w:val="single" w:color="E2D9C9" w:sz="4"/>
+              <w:bottom w:val="single" w:color="E2D9C9" w:sz="4"/>
+              <w:right w:val="single" w:color="E2D9C9" w:sz="4"/>
+            </w:tcBorders>
+            <w:tcMar>
+              <w:top w:type="dxa" w:w="70"/>
+              <w:left w:type="dxa" w:w="100"/>
+              <w:bottom w:type="dxa" w:w="70"/>
+              <w:right w:type="dxa" w:w="100"/>
+            </w:tcMar>
+          </w:tcPr>
+          <w:p>
+            <w:pPr>
+              <w:jc w:val="left"/>
+            </w:pPr>
+            <w:r>
+              <w:rPr>
+                <w:rFonts w:ascii="Calibri" w:cs="Calibri" w:eastAsia="Calibri" w:hAnsi="Calibri"/>
+                <w:b w:val="false"/>
+                <w:bCs w:val="false"/>
+                <w:color w:val="211A16"/>
+                <w:sz w:val="19"/>
+                <w:szCs w:val="19"/>
+              </w:rPr>
+              <w:t xml:space="preserve">Paul / lawyer</w:t>
+            </w:r>
+          </w:p>
+        </w:tc>
+        <w:tc>
+          <w:tcPr>
+            <w:tcW w:type="dxa" w:w="1900"/>
+            <w:tcBorders>
+              <w:top w:val="single" w:color="E2D9C9" w:sz="4"/>
+              <w:left w:val="single" w:color="E2D9C9" w:sz="4"/>
+              <w:bottom w:val="single" w:color="E2D9C9" w:sz="4"/>
+              <w:right w:val="single" w:color="E2D9C9" w:sz="4"/>
+            </w:tcBorders>
+            <w:tcMar>
+              <w:top w:type="dxa" w:w="70"/>
+              <w:left w:type="dxa" w:w="100"/>
+              <w:bottom w:type="dxa" w:w="70"/>
+              <w:right w:type="dxa" w:w="100"/>
+            </w:tcMar>
+          </w:tcPr>
+          <w:p>
+            <w:pPr>
+              <w:jc w:val="left"/>
+            </w:pPr>
+            <w:r>
+              <w:rPr>
+                <w:rFonts w:ascii="Calibri" w:cs="Calibri" w:eastAsia="Calibri" w:hAnsi="Calibri"/>
+                <w:b/>
+                <w:bCs/>
+                <w:color w:val="211A16"/>
+                <w:sz w:val="19"/>
+                <w:szCs w:val="19"/>
+              </w:rPr>
+              <w:t xml:space="preserve">Launch</w:t>
+            </w:r>
+          </w:p>
+        </w:tc>
+        <w:tc>
+          <w:tcPr>
+            <w:tcW w:type="dxa" w:w="1300"/>
+            <w:tcBorders>
+              <w:top w:val="single" w:color="E2D9C9" w:sz="4"/>
+              <w:left w:val="single" w:color="E2D9C9" w:sz="4"/>
+              <w:bottom w:val="single" w:color="E2D9C9" w:sz="4"/>
+              <w:right w:val="single" w:color="E2D9C9" w:sz="4"/>
+            </w:tcBorders>
+            <w:tcMar>
+              <w:top w:type="dxa" w:w="70"/>
+              <w:left w:type="dxa" w:w="100"/>
+              <w:bottom w:type="dxa" w:w="70"/>
+              <w:right w:type="dxa" w:w="100"/>
+            </w:tcMar>
+          </w:tcPr>
+          <w:p>
+            <w:pPr>
+              <w:jc w:val="center"/>
+            </w:pPr>
+            <w:r>
+              <w:rPr>
+                <w:rFonts w:ascii="Calibri" w:cs="Calibri" w:eastAsia="Calibri" w:hAnsi="Calibri"/>
+                <w:b w:val="false"/>
+                <w:bCs w:val="false"/>
+                <w:color w:val="211A16"/>
+                <w:sz w:val="26"/>
+                <w:szCs w:val="26"/>
+              </w:rPr>
+              <w:t xml:space="preserve">☐</w:t>
+            </w:r>
+          </w:p>
+        </w:tc>
+      </w:tr>
+    </w:tbl>
+    <w:p>
+      <w:pPr>
+        <w:pStyle w:val="Heading2"/>
+        <w:keepNext/>
+        <w:spacing w:after="80" w:before="280"/>
+      </w:pPr>
+      <w:r>
+        <w:rPr>
+          <w:rFonts w:ascii="Georgia" w:cs="Georgia" w:eastAsia="Georgia" w:hAnsi="Georgia"/>
+          <w:color w:val="211A16"/>
+          <w:sz w:val="30"/>
+          <w:szCs w:val="30"/>
+        </w:rPr>
+        <w:t xml:space="preserve">6. Accounts and access</w:t>
       </w:r>
     </w:p>
     <w:p>
@@ -6712,7 +8490,7 @@
                 <w:sz w:val="19"/>
                 <w:szCs w:val="19"/>
               </w:rPr>
-              <w:t xml:space="preserve">Powers the optional AI email drafting</w:t>
+              <w:t xml:space="preserve">Powers email summaries, reply drafts and marketing email drafting</w:t>
             </w:r>
           </w:p>
         </w:tc>
@@ -6772,13 +8550,13 @@
             <w:r>
               <w:rPr>
                 <w:rFonts w:ascii="Calibri" w:cs="Calibri" w:eastAsia="Calibri" w:hAnsi="Calibri"/>
-                <w:b/>
-                <w:bCs/>
-                <w:color w:val="211A16"/>
-                <w:sz w:val="19"/>
-                <w:szCs w:val="19"/>
-              </w:rPr>
-              <w:t xml:space="preserve">Launch</w:t>
+                <w:b w:val="false"/>
+                <w:bCs w:val="false"/>
+                <w:color w:val="211A16"/>
+                <w:sz w:val="19"/>
+                <w:szCs w:val="19"/>
+              </w:rPr>
+              <w:t xml:space="preserve">Build</w:t>
             </w:r>
           </w:p>
         </w:tc>
@@ -6850,7 +8628,7 @@
                 <w:sz w:val="19"/>
                 <w:szCs w:val="19"/>
               </w:rPr>
-              <w:t xml:space="preserve">Cloudflare Turnstile (free)</w:t>
+              <w:t xml:space="preserve">Google sign-in for the business inbox (done by the account owner inside the automation tool)</w:t>
             </w:r>
           </w:p>
         </w:tc>
@@ -6884,7 +8662,7 @@
                 <w:sz w:val="19"/>
                 <w:szCs w:val="19"/>
               </w:rPr>
-              <w:t xml:space="preserve">Blocks spam submissions on the website form</w:t>
+              <w:t xml:space="preserve">Lets the email assistant read and send from the inbox</w:t>
             </w:r>
           </w:p>
         </w:tc>
@@ -6918,7 +8696,7 @@
                 <w:sz w:val="19"/>
                 <w:szCs w:val="19"/>
               </w:rPr>
-              <w:t xml:space="preserve">Agency / developer</w:t>
+              <w:t xml:space="preserve">Paul / Madison</w:t>
             </w:r>
           </w:p>
         </w:tc>
@@ -6946,13 +8724,13 @@
             <w:r>
               <w:rPr>
                 <w:rFonts w:ascii="Calibri" w:cs="Calibri" w:eastAsia="Calibri" w:hAnsi="Calibri"/>
-                <w:b/>
-                <w:bCs/>
-                <w:color w:val="211A16"/>
-                <w:sz w:val="19"/>
-                <w:szCs w:val="19"/>
-              </w:rPr>
-              <w:t xml:space="preserve">Launch</w:t>
+                <w:b w:val="false"/>
+                <w:bCs w:val="false"/>
+                <w:color w:val="211A16"/>
+                <w:sz w:val="19"/>
+                <w:szCs w:val="19"/>
+              </w:rPr>
+              <w:t xml:space="preserve">Build</w:t>
             </w:r>
           </w:p>
         </w:tc>
@@ -7024,7 +8802,7 @@
                 <w:sz w:val="19"/>
                 <w:szCs w:val="19"/>
               </w:rPr>
-              <w:t xml:space="preserve">Production hosting account and a production database account, on a paid plan with backups</w:t>
+              <w:t xml:space="preserve">Cloudflare Turnstile (free)</w:t>
             </w:r>
           </w:p>
         </w:tc>
@@ -7057,40 +8835,40 @@
                 <w:sz w:val="19"/>
                 <w:szCs w:val="19"/>
               </w:rPr>
-              <w:t xml:space="preserve">Where the live system runs</w:t>
-            </w:r>
-          </w:p>
-        </w:tc>
-        <w:tc>
-          <w:tcPr>
-            <w:tcW w:type="dxa" w:w="1900"/>
-            <w:tcBorders>
-              <w:top w:val="single" w:color="E2D9C9" w:sz="4"/>
-              <w:left w:val="single" w:color="E2D9C9" w:sz="4"/>
-              <w:bottom w:val="single" w:color="E2D9C9" w:sz="4"/>
-              <w:right w:val="single" w:color="E2D9C9" w:sz="4"/>
-            </w:tcBorders>
-            <w:tcMar>
-              <w:top w:type="dxa" w:w="70"/>
-              <w:left w:type="dxa" w:w="100"/>
-              <w:bottom w:type="dxa" w:w="70"/>
-              <w:right w:type="dxa" w:w="100"/>
-            </w:tcMar>
-          </w:tcPr>
-          <w:p>
-            <w:pPr>
-              <w:jc w:val="left"/>
-            </w:pPr>
-            <w:r>
-              <w:rPr>
-                <w:rFonts w:ascii="Calibri" w:cs="Calibri" w:eastAsia="Calibri" w:hAnsi="Calibri"/>
-                <w:b w:val="false"/>
-                <w:bCs w:val="false"/>
-                <w:color w:val="211A16"/>
-                <w:sz w:val="19"/>
-                <w:szCs w:val="19"/>
-              </w:rPr>
-              <w:t xml:space="preserve">Paul / developer</w:t>
+              <w:t xml:space="preserve">Blocks spam submissions on the website form</w:t>
+            </w:r>
+          </w:p>
+        </w:tc>
+        <w:tc>
+          <w:tcPr>
+            <w:tcW w:type="dxa" w:w="1900"/>
+            <w:tcBorders>
+              <w:top w:val="single" w:color="E2D9C9" w:sz="4"/>
+              <w:left w:val="single" w:color="E2D9C9" w:sz="4"/>
+              <w:bottom w:val="single" w:color="E2D9C9" w:sz="4"/>
+              <w:right w:val="single" w:color="E2D9C9" w:sz="4"/>
+            </w:tcBorders>
+            <w:tcMar>
+              <w:top w:type="dxa" w:w="70"/>
+              <w:left w:type="dxa" w:w="100"/>
+              <w:bottom w:type="dxa" w:w="70"/>
+              <w:right w:type="dxa" w:w="100"/>
+            </w:tcMar>
+          </w:tcPr>
+          <w:p>
+            <w:pPr>
+              <w:jc w:val="left"/>
+            </w:pPr>
+            <w:r>
+              <w:rPr>
+                <w:rFonts w:ascii="Calibri" w:cs="Calibri" w:eastAsia="Calibri" w:hAnsi="Calibri"/>
+                <w:b w:val="false"/>
+                <w:bCs w:val="false"/>
+                <w:color w:val="211A16"/>
+                <w:sz w:val="19"/>
+                <w:szCs w:val="19"/>
+              </w:rPr>
+              <w:t xml:space="preserve">Agency / developer</w:t>
             </w:r>
           </w:p>
         </w:tc>
@@ -7195,7 +8973,7 @@
                 <w:sz w:val="19"/>
                 <w:szCs w:val="19"/>
               </w:rPr>
-              <w:t xml:space="preserve">n8n Cloud plan</w:t>
+              <w:t xml:space="preserve">Production hosting account and a production database account, on a paid plan with backups</w:t>
             </w:r>
           </w:p>
         </w:tc>
@@ -7229,7 +9007,7 @@
                 <w:sz w:val="19"/>
                 <w:szCs w:val="19"/>
               </w:rPr>
-              <w:t xml:space="preserve">Automation such as follow-ups and scheduled campaigns</w:t>
+              <w:t xml:space="preserve">Where the live system runs</w:t>
             </w:r>
           </w:p>
         </w:tc>
@@ -7263,7 +9041,7 @@
                 <w:sz w:val="19"/>
                 <w:szCs w:val="19"/>
               </w:rPr>
-              <w:t xml:space="preserve">Developer</w:t>
+              <w:t xml:space="preserve">Paul / developer</w:t>
             </w:r>
           </w:p>
         </w:tc>
@@ -7291,13 +9069,13 @@
             <w:r>
               <w:rPr>
                 <w:rFonts w:ascii="Calibri" w:cs="Calibri" w:eastAsia="Calibri" w:hAnsi="Calibri"/>
-                <w:b w:val="false"/>
-                <w:bCs w:val="false"/>
-                <w:color w:val="211A16"/>
-                <w:sz w:val="19"/>
-                <w:szCs w:val="19"/>
-              </w:rPr>
-              <w:t xml:space="preserve">Later</w:t>
+                <w:b/>
+                <w:bCs/>
+                <w:color w:val="211A16"/>
+                <w:sz w:val="19"/>
+                <w:szCs w:val="19"/>
+              </w:rPr>
+              <w:t xml:space="preserve">Launch</w:t>
             </w:r>
           </w:p>
         </w:tc>
@@ -7369,6 +9147,177 @@
                 <w:sz w:val="19"/>
                 <w:szCs w:val="19"/>
               </w:rPr>
+              <w:t xml:space="preserve">n8n Cloud plan</w:t>
+            </w:r>
+          </w:p>
+        </w:tc>
+        <w:tc>
+          <w:tcPr>
+            <w:tcW w:type="dxa" w:w="3900"/>
+            <w:tcBorders>
+              <w:top w:val="single" w:color="E2D9C9" w:sz="4"/>
+              <w:left w:val="single" w:color="E2D9C9" w:sz="4"/>
+              <w:bottom w:val="single" w:color="E2D9C9" w:sz="4"/>
+              <w:right w:val="single" w:color="E2D9C9" w:sz="4"/>
+            </w:tcBorders>
+            <w:tcMar>
+              <w:top w:type="dxa" w:w="70"/>
+              <w:left w:type="dxa" w:w="100"/>
+              <w:bottom w:type="dxa" w:w="70"/>
+              <w:right w:type="dxa" w:w="100"/>
+            </w:tcMar>
+          </w:tcPr>
+          <w:p>
+            <w:pPr>
+              <w:jc w:val="left"/>
+            </w:pPr>
+            <w:r>
+              <w:rPr>
+                <w:rFonts w:ascii="Calibri" w:cs="Calibri" w:eastAsia="Calibri" w:hAnsi="Calibri"/>
+                <w:b w:val="false"/>
+                <w:bCs w:val="false"/>
+                <w:color w:val="5A4D42"/>
+                <w:sz w:val="19"/>
+                <w:szCs w:val="19"/>
+              </w:rPr>
+              <w:t xml:space="preserve">Watches the inbox and runs follow-ups and scheduled marketing emails</w:t>
+            </w:r>
+          </w:p>
+        </w:tc>
+        <w:tc>
+          <w:tcPr>
+            <w:tcW w:type="dxa" w:w="1900"/>
+            <w:tcBorders>
+              <w:top w:val="single" w:color="E2D9C9" w:sz="4"/>
+              <w:left w:val="single" w:color="E2D9C9" w:sz="4"/>
+              <w:bottom w:val="single" w:color="E2D9C9" w:sz="4"/>
+              <w:right w:val="single" w:color="E2D9C9" w:sz="4"/>
+            </w:tcBorders>
+            <w:tcMar>
+              <w:top w:type="dxa" w:w="70"/>
+              <w:left w:type="dxa" w:w="100"/>
+              <w:bottom w:type="dxa" w:w="70"/>
+              <w:right w:type="dxa" w:w="100"/>
+            </w:tcMar>
+          </w:tcPr>
+          <w:p>
+            <w:pPr>
+              <w:jc w:val="left"/>
+            </w:pPr>
+            <w:r>
+              <w:rPr>
+                <w:rFonts w:ascii="Calibri" w:cs="Calibri" w:eastAsia="Calibri" w:hAnsi="Calibri"/>
+                <w:b w:val="false"/>
+                <w:bCs w:val="false"/>
+                <w:color w:val="211A16"/>
+                <w:sz w:val="19"/>
+                <w:szCs w:val="19"/>
+              </w:rPr>
+              <w:t xml:space="preserve">Developer</w:t>
+            </w:r>
+          </w:p>
+        </w:tc>
+        <w:tc>
+          <w:tcPr>
+            <w:tcW w:type="dxa" w:w="1900"/>
+            <w:tcBorders>
+              <w:top w:val="single" w:color="E2D9C9" w:sz="4"/>
+              <w:left w:val="single" w:color="E2D9C9" w:sz="4"/>
+              <w:bottom w:val="single" w:color="E2D9C9" w:sz="4"/>
+              <w:right w:val="single" w:color="E2D9C9" w:sz="4"/>
+            </w:tcBorders>
+            <w:tcMar>
+              <w:top w:type="dxa" w:w="70"/>
+              <w:left w:type="dxa" w:w="100"/>
+              <w:bottom w:type="dxa" w:w="70"/>
+              <w:right w:type="dxa" w:w="100"/>
+            </w:tcMar>
+          </w:tcPr>
+          <w:p>
+            <w:pPr>
+              <w:jc w:val="left"/>
+            </w:pPr>
+            <w:r>
+              <w:rPr>
+                <w:rFonts w:ascii="Calibri" w:cs="Calibri" w:eastAsia="Calibri" w:hAnsi="Calibri"/>
+                <w:b w:val="false"/>
+                <w:bCs w:val="false"/>
+                <w:color w:val="211A16"/>
+                <w:sz w:val="19"/>
+                <w:szCs w:val="19"/>
+              </w:rPr>
+              <w:t xml:space="preserve">Build</w:t>
+            </w:r>
+          </w:p>
+        </w:tc>
+        <w:tc>
+          <w:tcPr>
+            <w:tcW w:type="dxa" w:w="1300"/>
+            <w:tcBorders>
+              <w:top w:val="single" w:color="E2D9C9" w:sz="4"/>
+              <w:left w:val="single" w:color="E2D9C9" w:sz="4"/>
+              <w:bottom w:val="single" w:color="E2D9C9" w:sz="4"/>
+              <w:right w:val="single" w:color="E2D9C9" w:sz="4"/>
+            </w:tcBorders>
+            <w:tcMar>
+              <w:top w:type="dxa" w:w="70"/>
+              <w:left w:type="dxa" w:w="100"/>
+              <w:bottom w:type="dxa" w:w="70"/>
+              <w:right w:type="dxa" w:w="100"/>
+            </w:tcMar>
+          </w:tcPr>
+          <w:p>
+            <w:pPr>
+              <w:jc w:val="center"/>
+            </w:pPr>
+            <w:r>
+              <w:rPr>
+                <w:rFonts w:ascii="Calibri" w:cs="Calibri" w:eastAsia="Calibri" w:hAnsi="Calibri"/>
+                <w:b w:val="false"/>
+                <w:bCs w:val="false"/>
+                <w:color w:val="211A16"/>
+                <w:sz w:val="26"/>
+                <w:szCs w:val="26"/>
+              </w:rPr>
+              <w:t xml:space="preserve">☐</w:t>
+            </w:r>
+          </w:p>
+        </w:tc>
+      </w:tr>
+      <w:tr>
+        <w:trPr>
+          <w:cantSplit/>
+        </w:trPr>
+        <w:tc>
+          <w:tcPr>
+            <w:tcW w:type="dxa" w:w="4800"/>
+            <w:tcBorders>
+              <w:top w:val="single" w:color="E2D9C9" w:sz="4"/>
+              <w:left w:val="single" w:color="E2D9C9" w:sz="4"/>
+              <w:bottom w:val="single" w:color="E2D9C9" w:sz="4"/>
+              <w:right w:val="single" w:color="E2D9C9" w:sz="4"/>
+            </w:tcBorders>
+            <w:shd w:fill="FBF8F2" w:color="auto" w:val="clear"/>
+            <w:tcMar>
+              <w:top w:type="dxa" w:w="70"/>
+              <w:left w:type="dxa" w:w="100"/>
+              <w:bottom w:type="dxa" w:w="70"/>
+              <w:right w:type="dxa" w:w="100"/>
+            </w:tcMar>
+          </w:tcPr>
+          <w:p>
+            <w:pPr>
+              <w:jc w:val="left"/>
+            </w:pPr>
+            <w:r>
+              <w:rPr>
+                <w:rFonts w:ascii="Calibri" w:cs="Calibri" w:eastAsia="Calibri" w:hAnsi="Calibri"/>
+                <w:b w:val="false"/>
+                <w:bCs w:val="false"/>
+                <w:color w:val="211A16"/>
+                <w:sz w:val="19"/>
+                <w:szCs w:val="19"/>
+              </w:rPr>
               <w:t xml:space="preserve">Web address for the dashboard (for example a subdomain)</w:t>
             </w:r>
           </w:p>
@@ -7382,6 +9331,7 @@
               <w:bottom w:val="single" w:color="E2D9C9" w:sz="4"/>
               <w:right w:val="single" w:color="E2D9C9" w:sz="4"/>
             </w:tcBorders>
+            <w:shd w:fill="FBF8F2" w:color="auto" w:val="clear"/>
             <w:tcMar>
               <w:top w:type="dxa" w:w="70"/>
               <w:left w:type="dxa" w:w="100"/>
@@ -7415,6 +9365,7 @@
               <w:bottom w:val="single" w:color="E2D9C9" w:sz="4"/>
               <w:right w:val="single" w:color="E2D9C9" w:sz="4"/>
             </w:tcBorders>
+            <w:shd w:fill="FBF8F2" w:color="auto" w:val="clear"/>
             <w:tcMar>
               <w:top w:type="dxa" w:w="70"/>
               <w:left w:type="dxa" w:w="100"/>
@@ -7448,6 +9399,7 @@
               <w:bottom w:val="single" w:color="E2D9C9" w:sz="4"/>
               <w:right w:val="single" w:color="E2D9C9" w:sz="4"/>
             </w:tcBorders>
+            <w:shd w:fill="FBF8F2" w:color="auto" w:val="clear"/>
             <w:tcMar>
               <w:top w:type="dxa" w:w="70"/>
               <w:left w:type="dxa" w:w="100"/>
@@ -7481,6 +9433,7 @@
               <w:bottom w:val="single" w:color="E2D9C9" w:sz="4"/>
               <w:right w:val="single" w:color="E2D9C9" w:sz="4"/>
             </w:tcBorders>
+            <w:shd w:fill="FBF8F2" w:color="auto" w:val="clear"/>
             <w:tcMar>
               <w:top w:type="dxa" w:w="70"/>
               <w:left w:type="dxa" w:w="100"/>
@@ -7520,7 +9473,7 @@
           <w:sz w:val="30"/>
           <w:szCs w:val="30"/>
         </w:rPr>
-        <w:t xml:space="preserve">6. Website</w:t>
+        <w:t xml:space="preserve">7. Website</w:t>
       </w:r>
     </w:p>
     <w:p>
@@ -8438,7 +10391,7 @@
           <w:sz w:val="30"/>
           <w:szCs w:val="30"/>
         </w:rPr>
-        <w:t xml:space="preserve">7. Legal and privacy</w:t>
+        <w:t xml:space="preserve">8. Legal and privacy</w:t>
       </w:r>
     </w:p>
     <w:p>
@@ -9181,7 +11134,7 @@
           <w:sz w:val="30"/>
           <w:szCs w:val="30"/>
         </w:rPr>
-        <w:t xml:space="preserve">8. Testing and launch</w:t>
+        <w:t xml:space="preserve">9. Testing and launch</w:t>
       </w:r>
     </w:p>
     <w:p>

</xml_diff>